<commit_message>
docs: replace report commit table with GitHub page screenshot and note public access
</commit_message>
<xml_diff>
--- a/实验1报告_郭毅川_2024414290411.docx
+++ b/实验1报告_郭毅川_2024414290411.docx
@@ -2822,6 +2822,108 @@
     </w:p>
     <w:p>
       <w:pPr>
+        <w:spacing w:line="340" w:lineRule="exact" w:after="100" w:before="0"/>
+        <w:keepNext/>
+        <w:snapToGrid w:val="0"/>
+      </w:pPr>
+      <w:r>
+        <w:rPr>
+          <w:rFonts w:ascii="Times New Roman" w:hAnsi="Times New Roman" w:eastAsia="宋体"/>
+          <w:color w:val="000000"/>
+          <w:sz w:val="22"/>
+        </w:rPr>
+        <w:t>仓库已设为公开。以下为 GitHub 提交历史网页的直接截图，保留仓库名称、提交说明、作者与提交哈希。</w:t>
+      </w:r>
+    </w:p>
+    <w:p>
+      <w:pPr>
+        <w:keepNext/>
+        <w:jc w:val="center"/>
+      </w:pPr>
+      <w:r>
+        <w:drawing>
+          <wp:inline xmlns:a="http://schemas.openxmlformats.org/drawingml/2006/main" xmlns:pic="http://schemas.openxmlformats.org/drawingml/2006/picture">
+            <wp:extent cx="3931920" cy="6498499"/>
+            <wp:docPr id="2" name="Picture 2"/>
+            <wp:cNvGraphicFramePr>
+              <a:graphicFrameLocks noChangeAspect="1"/>
+            </wp:cNvGraphicFramePr>
+            <a:graphic>
+              <a:graphicData uri="http://schemas.openxmlformats.org/drawingml/2006/picture">
+                <pic:pic>
+                  <pic:nvPicPr>
+                    <pic:cNvPr id="0" name="github-commits.jpg"/>
+                    <pic:cNvPicPr/>
+                  </pic:nvPicPr>
+                  <pic:blipFill>
+                    <a:blip r:embed="rId16"/>
+                    <a:stretch>
+                      <a:fillRect/>
+                    </a:stretch>
+                  </pic:blipFill>
+                  <pic:spPr>
+                    <a:xfrm>
+                      <a:off x="0" y="0"/>
+                      <a:ext cx="3931920" cy="6498499"/>
+                    </a:xfrm>
+                    <a:prstGeom prst="rect"/>
+                  </pic:spPr>
+                </pic:pic>
+              </a:graphicData>
+            </a:graphic>
+          </wp:inline>
+        </w:drawing>
+      </w:r>
+    </w:p>
+    <w:p>
+      <w:pPr>
+        <w:spacing w:line="300" w:lineRule="exact" w:after="100" w:before="0"/>
+        <w:snapToGrid w:val="0"/>
+        <w:jc w:val="center"/>
+      </w:pPr>
+      <w:r>
+        <w:rPr>
+          <w:rFonts w:ascii="Times New Roman" w:hAnsi="Times New Roman" w:eastAsia="宋体"/>
+          <w:color w:val="000000"/>
+          <w:sz w:val="20"/>
+        </w:rPr>
+        <w:t>图 2  GitHub 提交历史网页截图</w:t>
+      </w:r>
+    </w:p>
+    <w:p>
+      <w:pPr>
+        <w:spacing w:line="340" w:lineRule="exact" w:after="100" w:before="0"/>
+        <w:snapToGrid w:val="0"/>
+      </w:pPr>
+      <w:r>
+        <w:rPr>
+          <w:rFonts w:ascii="Times New Roman" w:hAnsi="Times New Roman" w:eastAsia="宋体"/>
+          <w:color w:val="000000"/>
+          <w:sz w:val="22"/>
+        </w:rPr>
+        <w:t>提交历史页面  https://github.com/TabGYC/qt-exp1-calculator-2026/commits/main/</w:t>
+      </w:r>
+    </w:p>
+    <w:p>
+      <w:pPr>
+        <w:keepNext/>
+        <w:widowControl/>
+        <w:snapToGrid w:val="0"/>
+        <w:spacing w:before="140" w:after="100" w:line="380" w:lineRule="exact"/>
+        <w:ind w:firstLine="0"/>
+      </w:pPr>
+      <w:r>
+        <w:rPr>
+          <w:rFonts w:ascii="Times New Roman" w:hAnsi="Times New Roman" w:eastAsia="宋体"/>
+          <w:b/>
+          <w:color w:val="000000"/>
+          <w:sz w:val="24"/>
+        </w:rPr>
+        <w:t>六  AI 辅助开发记录</w:t>
+      </w:r>
+    </w:p>
+    <w:p>
+      <w:pPr>
         <w:keepNext w:val="0"/>
         <w:widowControl/>
         <w:snapToGrid w:val="0"/>
@@ -2835,609 +2937,7 @@
           <w:color w:val="000000"/>
           <w:sz w:val="22"/>
         </w:rPr>
-        <w:t>仓库为独立私有仓库，提交按功能开发、测试和修复的实际顺序保留。下表列出生成本报告前的主要提交。</w:t>
-      </w:r>
-    </w:p>
-    <w:tbl>
-      <w:tblPr>
-        <w:tblW w:type="auto" w:w="0"/>
-        <w:jc w:val="center"/>
-        <w:tblLayout w:type="fixed"/>
-        <w:tblLook w:firstColumn="1" w:firstRow="1" w:lastColumn="0" w:lastRow="0" w:noHBand="0" w:noVBand="1" w:val="04A0"/>
-      </w:tblPr>
-      <w:tblGrid>
-        <w:gridCol w:w="1224"/>
-        <w:gridCol w:w="8640"/>
-      </w:tblGrid>
-      <w:tr>
-        <w:trPr>
-          <w:tblHeader/>
-          <w:cantSplit/>
-        </w:trPr>
-        <w:tc>
-          <w:tcPr>
-            <w:tcW w:type="dxa" w:w="1224"/>
-            <w:vAlign w:val="center"/>
-            <w:tcBorders>
-              <w:top w:val="single" w:sz="4" w:color="D9D9D9"/>
-              <w:left w:val="single" w:sz="4" w:color="D9D9D9"/>
-              <w:bottom w:val="single" w:sz="4" w:color="D9D9D9"/>
-              <w:right w:val="single" w:sz="4" w:color="D9D9D9"/>
-            </w:tcBorders>
-            <w:tcMar>
-              <w:top w:w="75" w:type="dxa"/>
-              <w:left w:w="75" w:type="dxa"/>
-              <w:bottom w:w="75" w:type="dxa"/>
-              <w:right w:w="75" w:type="dxa"/>
-            </w:tcMar>
-            <w:shd w:fill="EAECEF"/>
-          </w:tcPr>
-          <w:p>
-            <w:pPr>
-              <w:snapToGrid w:val="0"/>
-              <w:spacing w:after="60" w:before="60" w:line="276" w:lineRule="auto"/>
-            </w:pPr>
-            <w:r>
-              <w:rPr>
-                <w:rFonts w:ascii="Times New Roman" w:hAnsi="Times New Roman" w:eastAsia="宋体"/>
-                <w:b/>
-                <w:color w:val="000000"/>
-                <w:sz w:val="19"/>
-              </w:rPr>
-              <w:t>提交</w:t>
-            </w:r>
-          </w:p>
-        </w:tc>
-        <w:tc>
-          <w:tcPr>
-            <w:tcW w:type="dxa" w:w="8640"/>
-            <w:vAlign w:val="center"/>
-            <w:tcBorders>
-              <w:top w:val="single" w:sz="4" w:color="D9D9D9"/>
-              <w:left w:val="single" w:sz="4" w:color="D9D9D9"/>
-              <w:bottom w:val="single" w:sz="4" w:color="D9D9D9"/>
-              <w:right w:val="single" w:sz="4" w:color="D9D9D9"/>
-            </w:tcBorders>
-            <w:tcMar>
-              <w:top w:w="75" w:type="dxa"/>
-              <w:left w:w="75" w:type="dxa"/>
-              <w:bottom w:w="75" w:type="dxa"/>
-              <w:right w:w="75" w:type="dxa"/>
-            </w:tcMar>
-            <w:shd w:fill="EAECEF"/>
-          </w:tcPr>
-          <w:p>
-            <w:pPr>
-              <w:snapToGrid w:val="0"/>
-              <w:spacing w:after="60" w:before="60" w:line="276" w:lineRule="auto"/>
-            </w:pPr>
-            <w:r>
-              <w:rPr>
-                <w:rFonts w:ascii="Times New Roman" w:hAnsi="Times New Roman" w:eastAsia="宋体"/>
-                <w:b/>
-                <w:color w:val="000000"/>
-                <w:sz w:val="19"/>
-              </w:rPr>
-              <w:t>工作内容</w:t>
-            </w:r>
-          </w:p>
-        </w:tc>
-      </w:tr>
-      <w:tr>
-        <w:trPr>
-          <w:cantSplit/>
-        </w:trPr>
-        <w:tc>
-          <w:tcPr>
-            <w:tcW w:type="dxa" w:w="1224"/>
-            <w:vAlign w:val="center"/>
-            <w:tcBorders>
-              <w:top w:val="single" w:sz="4" w:color="D9D9D9"/>
-              <w:left w:val="single" w:sz="4" w:color="D9D9D9"/>
-              <w:bottom w:val="single" w:sz="4" w:color="D9D9D9"/>
-              <w:right w:val="single" w:sz="4" w:color="D9D9D9"/>
-            </w:tcBorders>
-            <w:tcMar>
-              <w:top w:w="75" w:type="dxa"/>
-              <w:left w:w="75" w:type="dxa"/>
-              <w:bottom w:w="75" w:type="dxa"/>
-              <w:right w:w="75" w:type="dxa"/>
-            </w:tcMar>
-          </w:tcPr>
-          <w:p>
-            <w:pPr>
-              <w:snapToGrid w:val="0"/>
-              <w:spacing w:after="60" w:before="60" w:line="276" w:lineRule="auto"/>
-            </w:pPr>
-            <w:r>
-              <w:rPr>
-                <w:rFonts w:ascii="Times New Roman" w:hAnsi="Times New Roman" w:eastAsia="宋体"/>
-                <w:b w:val="0"/>
-                <w:color w:val="000000"/>
-                <w:sz w:val="19"/>
-              </w:rPr>
-              <w:t>26103fb</w:t>
-            </w:r>
-          </w:p>
-        </w:tc>
-        <w:tc>
-          <w:tcPr>
-            <w:tcW w:type="dxa" w:w="8640"/>
-            <w:vAlign w:val="center"/>
-            <w:tcBorders>
-              <w:top w:val="single" w:sz="4" w:color="D9D9D9"/>
-              <w:left w:val="single" w:sz="4" w:color="D9D9D9"/>
-              <w:bottom w:val="single" w:sz="4" w:color="D9D9D9"/>
-              <w:right w:val="single" w:sz="4" w:color="D9D9D9"/>
-            </w:tcBorders>
-            <w:tcMar>
-              <w:top w:w="75" w:type="dxa"/>
-              <w:left w:w="75" w:type="dxa"/>
-              <w:bottom w:w="75" w:type="dxa"/>
-              <w:right w:w="75" w:type="dxa"/>
-            </w:tcMar>
-          </w:tcPr>
-          <w:p>
-            <w:pPr>
-              <w:snapToGrid w:val="0"/>
-              <w:spacing w:after="60" w:before="60" w:line="276" w:lineRule="auto"/>
-            </w:pPr>
-            <w:r>
-              <w:rPr>
-                <w:rFonts w:ascii="Times New Roman" w:hAnsi="Times New Roman" w:eastAsia="宋体"/>
-                <w:b w:val="0"/>
-                <w:color w:val="000000"/>
-                <w:sz w:val="19"/>
-              </w:rPr>
-              <w:t>feat: add Designer calculator layout and project structure</w:t>
-            </w:r>
-          </w:p>
-        </w:tc>
-      </w:tr>
-      <w:tr>
-        <w:trPr>
-          <w:cantSplit/>
-        </w:trPr>
-        <w:tc>
-          <w:tcPr>
-            <w:tcW w:type="dxa" w:w="1224"/>
-            <w:vAlign w:val="center"/>
-            <w:tcBorders>
-              <w:top w:val="single" w:sz="4" w:color="D9D9D9"/>
-              <w:left w:val="single" w:sz="4" w:color="D9D9D9"/>
-              <w:bottom w:val="single" w:sz="4" w:color="D9D9D9"/>
-              <w:right w:val="single" w:sz="4" w:color="D9D9D9"/>
-            </w:tcBorders>
-            <w:tcMar>
-              <w:top w:w="75" w:type="dxa"/>
-              <w:left w:w="75" w:type="dxa"/>
-              <w:bottom w:w="75" w:type="dxa"/>
-              <w:right w:w="75" w:type="dxa"/>
-            </w:tcMar>
-          </w:tcPr>
-          <w:p>
-            <w:pPr>
-              <w:snapToGrid w:val="0"/>
-              <w:spacing w:after="60" w:before="60" w:line="276" w:lineRule="auto"/>
-            </w:pPr>
-            <w:r>
-              <w:rPr>
-                <w:rFonts w:ascii="Times New Roman" w:hAnsi="Times New Roman" w:eastAsia="宋体"/>
-                <w:b w:val="0"/>
-                <w:color w:val="000000"/>
-                <w:sz w:val="19"/>
-              </w:rPr>
-              <w:t>95dfba1</w:t>
-            </w:r>
-          </w:p>
-        </w:tc>
-        <w:tc>
-          <w:tcPr>
-            <w:tcW w:type="dxa" w:w="8640"/>
-            <w:vAlign w:val="center"/>
-            <w:tcBorders>
-              <w:top w:val="single" w:sz="4" w:color="D9D9D9"/>
-              <w:left w:val="single" w:sz="4" w:color="D9D9D9"/>
-              <w:bottom w:val="single" w:sz="4" w:color="D9D9D9"/>
-              <w:right w:val="single" w:sz="4" w:color="D9D9D9"/>
-            </w:tcBorders>
-            <w:tcMar>
-              <w:top w:w="75" w:type="dxa"/>
-              <w:left w:w="75" w:type="dxa"/>
-              <w:bottom w:w="75" w:type="dxa"/>
-              <w:right w:w="75" w:type="dxa"/>
-            </w:tcMar>
-          </w:tcPr>
-          <w:p>
-            <w:pPr>
-              <w:snapToGrid w:val="0"/>
-              <w:spacing w:after="60" w:before="60" w:line="276" w:lineRule="auto"/>
-            </w:pPr>
-            <w:r>
-              <w:rPr>
-                <w:rFonts w:ascii="Times New Roman" w:hAnsi="Times New Roman" w:eastAsia="宋体"/>
-                <w:b w:val="0"/>
-                <w:color w:val="000000"/>
-                <w:sz w:val="19"/>
-              </w:rPr>
-              <w:t>feat: implement decimal entry and sequential arithmetic state machine</w:t>
-            </w:r>
-          </w:p>
-        </w:tc>
-      </w:tr>
-      <w:tr>
-        <w:trPr>
-          <w:cantSplit/>
-        </w:trPr>
-        <w:tc>
-          <w:tcPr>
-            <w:tcW w:type="dxa" w:w="1224"/>
-            <w:vAlign w:val="center"/>
-            <w:tcBorders>
-              <w:top w:val="single" w:sz="4" w:color="D9D9D9"/>
-              <w:left w:val="single" w:sz="4" w:color="D9D9D9"/>
-              <w:bottom w:val="single" w:sz="4" w:color="D9D9D9"/>
-              <w:right w:val="single" w:sz="4" w:color="D9D9D9"/>
-            </w:tcBorders>
-            <w:tcMar>
-              <w:top w:w="75" w:type="dxa"/>
-              <w:left w:w="75" w:type="dxa"/>
-              <w:bottom w:w="75" w:type="dxa"/>
-              <w:right w:w="75" w:type="dxa"/>
-            </w:tcMar>
-          </w:tcPr>
-          <w:p>
-            <w:pPr>
-              <w:snapToGrid w:val="0"/>
-              <w:spacing w:after="60" w:before="60" w:line="276" w:lineRule="auto"/>
-            </w:pPr>
-            <w:r>
-              <w:rPr>
-                <w:rFonts w:ascii="Times New Roman" w:hAnsi="Times New Roman" w:eastAsia="宋体"/>
-                <w:b w:val="0"/>
-                <w:color w:val="000000"/>
-                <w:sz w:val="19"/>
-              </w:rPr>
-              <w:t>f1b1202</w:t>
-            </w:r>
-          </w:p>
-        </w:tc>
-        <w:tc>
-          <w:tcPr>
-            <w:tcW w:type="dxa" w:w="8640"/>
-            <w:vAlign w:val="center"/>
-            <w:tcBorders>
-              <w:top w:val="single" w:sz="4" w:color="D9D9D9"/>
-              <w:left w:val="single" w:sz="4" w:color="D9D9D9"/>
-              <w:bottom w:val="single" w:sz="4" w:color="D9D9D9"/>
-              <w:right w:val="single" w:sz="4" w:color="D9D9D9"/>
-            </w:tcBorders>
-            <w:tcMar>
-              <w:top w:w="75" w:type="dxa"/>
-              <w:left w:w="75" w:type="dxa"/>
-              <w:bottom w:w="75" w:type="dxa"/>
-              <w:right w:w="75" w:type="dxa"/>
-            </w:tcMar>
-          </w:tcPr>
-          <w:p>
-            <w:pPr>
-              <w:snapToGrid w:val="0"/>
-              <w:spacing w:after="60" w:before="60" w:line="276" w:lineRule="auto"/>
-            </w:pPr>
-            <w:r>
-              <w:rPr>
-                <w:rFonts w:ascii="Times New Roman" w:hAnsi="Times New Roman" w:eastAsia="宋体"/>
-                <w:b w:val="0"/>
-                <w:color w:val="000000"/>
-                <w:sz w:val="19"/>
-              </w:rPr>
-              <w:t>feat: unify mouse and keyboard dispatch and style calculator</w:t>
-            </w:r>
-          </w:p>
-        </w:tc>
-      </w:tr>
-      <w:tr>
-        <w:trPr>
-          <w:cantSplit/>
-        </w:trPr>
-        <w:tc>
-          <w:tcPr>
-            <w:tcW w:type="dxa" w:w="1224"/>
-            <w:vAlign w:val="center"/>
-            <w:tcBorders>
-              <w:top w:val="single" w:sz="4" w:color="D9D9D9"/>
-              <w:left w:val="single" w:sz="4" w:color="D9D9D9"/>
-              <w:bottom w:val="single" w:sz="4" w:color="D9D9D9"/>
-              <w:right w:val="single" w:sz="4" w:color="D9D9D9"/>
-            </w:tcBorders>
-            <w:tcMar>
-              <w:top w:w="75" w:type="dxa"/>
-              <w:left w:w="75" w:type="dxa"/>
-              <w:bottom w:w="75" w:type="dxa"/>
-              <w:right w:w="75" w:type="dxa"/>
-            </w:tcMar>
-          </w:tcPr>
-          <w:p>
-            <w:pPr>
-              <w:snapToGrid w:val="0"/>
-              <w:spacing w:after="60" w:before="60" w:line="276" w:lineRule="auto"/>
-            </w:pPr>
-            <w:r>
-              <w:rPr>
-                <w:rFonts w:ascii="Times New Roman" w:hAnsi="Times New Roman" w:eastAsia="宋体"/>
-                <w:b w:val="0"/>
-                <w:color w:val="000000"/>
-                <w:sz w:val="19"/>
-              </w:rPr>
-              <w:t>53bcb0f</w:t>
-            </w:r>
-          </w:p>
-        </w:tc>
-        <w:tc>
-          <w:tcPr>
-            <w:tcW w:type="dxa" w:w="8640"/>
-            <w:vAlign w:val="center"/>
-            <w:tcBorders>
-              <w:top w:val="single" w:sz="4" w:color="D9D9D9"/>
-              <w:left w:val="single" w:sz="4" w:color="D9D9D9"/>
-              <w:bottom w:val="single" w:sz="4" w:color="D9D9D9"/>
-              <w:right w:val="single" w:sz="4" w:color="D9D9D9"/>
-            </w:tcBorders>
-            <w:tcMar>
-              <w:top w:w="75" w:type="dxa"/>
-              <w:left w:w="75" w:type="dxa"/>
-              <w:bottom w:w="75" w:type="dxa"/>
-              <w:right w:w="75" w:type="dxa"/>
-            </w:tcMar>
-          </w:tcPr>
-          <w:p>
-            <w:pPr>
-              <w:snapToGrid w:val="0"/>
-              <w:spacing w:after="60" w:before="60" w:line="276" w:lineRule="auto"/>
-            </w:pPr>
-            <w:r>
-              <w:rPr>
-                <w:rFonts w:ascii="Times New Roman" w:hAnsi="Times New Roman" w:eastAsia="宋体"/>
-                <w:b w:val="0"/>
-                <w:color w:val="000000"/>
-                <w:sz w:val="19"/>
-              </w:rPr>
-              <w:t>test: verify arithmetic keyboard focus and mixed mouse input</w:t>
-            </w:r>
-          </w:p>
-        </w:tc>
-      </w:tr>
-      <w:tr>
-        <w:trPr>
-          <w:cantSplit/>
-        </w:trPr>
-        <w:tc>
-          <w:tcPr>
-            <w:tcW w:type="dxa" w:w="1224"/>
-            <w:vAlign w:val="center"/>
-            <w:tcBorders>
-              <w:top w:val="single" w:sz="4" w:color="D9D9D9"/>
-              <w:left w:val="single" w:sz="4" w:color="D9D9D9"/>
-              <w:bottom w:val="single" w:sz="4" w:color="D9D9D9"/>
-              <w:right w:val="single" w:sz="4" w:color="D9D9D9"/>
-            </w:tcBorders>
-            <w:tcMar>
-              <w:top w:w="75" w:type="dxa"/>
-              <w:left w:w="75" w:type="dxa"/>
-              <w:bottom w:w="75" w:type="dxa"/>
-              <w:right w:w="75" w:type="dxa"/>
-            </w:tcMar>
-          </w:tcPr>
-          <w:p>
-            <w:pPr>
-              <w:snapToGrid w:val="0"/>
-              <w:spacing w:after="60" w:before="60" w:line="276" w:lineRule="auto"/>
-            </w:pPr>
-            <w:r>
-              <w:rPr>
-                <w:rFonts w:ascii="Times New Roman" w:hAnsi="Times New Roman" w:eastAsia="宋体"/>
-                <w:b w:val="0"/>
-                <w:color w:val="000000"/>
-                <w:sz w:val="19"/>
-              </w:rPr>
-              <w:t>724b33d</w:t>
-            </w:r>
-          </w:p>
-        </w:tc>
-        <w:tc>
-          <w:tcPr>
-            <w:tcW w:type="dxa" w:w="8640"/>
-            <w:vAlign w:val="center"/>
-            <w:tcBorders>
-              <w:top w:val="single" w:sz="4" w:color="D9D9D9"/>
-              <w:left w:val="single" w:sz="4" w:color="D9D9D9"/>
-              <w:bottom w:val="single" w:sz="4" w:color="D9D9D9"/>
-              <w:right w:val="single" w:sz="4" w:color="D9D9D9"/>
-            </w:tcBorders>
-            <w:tcMar>
-              <w:top w:w="75" w:type="dxa"/>
-              <w:left w:w="75" w:type="dxa"/>
-              <w:bottom w:w="75" w:type="dxa"/>
-              <w:right w:w="75" w:type="dxa"/>
-            </w:tcMar>
-          </w:tcPr>
-          <w:p>
-            <w:pPr>
-              <w:snapToGrid w:val="0"/>
-              <w:spacing w:after="60" w:before="60" w:line="276" w:lineRule="auto"/>
-            </w:pPr>
-            <w:r>
-              <w:rPr>
-                <w:rFonts w:ascii="Times New Roman" w:hAnsi="Times New Roman" w:eastAsia="宋体"/>
-                <w:b w:val="0"/>
-                <w:color w:val="000000"/>
-                <w:sz w:val="19"/>
-              </w:rPr>
-              <w:t>fix: preserve negative zero for negative fractional input with regression test</w:t>
-            </w:r>
-          </w:p>
-        </w:tc>
-      </w:tr>
-      <w:tr>
-        <w:trPr>
-          <w:cantSplit/>
-        </w:trPr>
-        <w:tc>
-          <w:tcPr>
-            <w:tcW w:type="dxa" w:w="1224"/>
-            <w:vAlign w:val="center"/>
-            <w:tcBorders>
-              <w:top w:val="single" w:sz="4" w:color="D9D9D9"/>
-              <w:left w:val="single" w:sz="4" w:color="D9D9D9"/>
-              <w:bottom w:val="single" w:sz="4" w:color="D9D9D9"/>
-              <w:right w:val="single" w:sz="4" w:color="D9D9D9"/>
-            </w:tcBorders>
-            <w:tcMar>
-              <w:top w:w="75" w:type="dxa"/>
-              <w:left w:w="75" w:type="dxa"/>
-              <w:bottom w:w="75" w:type="dxa"/>
-              <w:right w:w="75" w:type="dxa"/>
-            </w:tcMar>
-          </w:tcPr>
-          <w:p>
-            <w:pPr>
-              <w:snapToGrid w:val="0"/>
-              <w:spacing w:after="60" w:before="60" w:line="276" w:lineRule="auto"/>
-            </w:pPr>
-            <w:r>
-              <w:rPr>
-                <w:rFonts w:ascii="Times New Roman" w:hAnsi="Times New Roman" w:eastAsia="宋体"/>
-                <w:b w:val="0"/>
-                <w:color w:val="000000"/>
-                <w:sz w:val="19"/>
-              </w:rPr>
-              <w:t>2a28a92</w:t>
-            </w:r>
-          </w:p>
-        </w:tc>
-        <w:tc>
-          <w:tcPr>
-            <w:tcW w:type="dxa" w:w="8640"/>
-            <w:vAlign w:val="center"/>
-            <w:tcBorders>
-              <w:top w:val="single" w:sz="4" w:color="D9D9D9"/>
-              <w:left w:val="single" w:sz="4" w:color="D9D9D9"/>
-              <w:bottom w:val="single" w:sz="4" w:color="D9D9D9"/>
-              <w:right w:val="single" w:sz="4" w:color="D9D9D9"/>
-            </w:tcBorders>
-            <w:tcMar>
-              <w:top w:w="75" w:type="dxa"/>
-              <w:left w:w="75" w:type="dxa"/>
-              <w:bottom w:w="75" w:type="dxa"/>
-              <w:right w:w="75" w:type="dxa"/>
-            </w:tcMar>
-          </w:tcPr>
-          <w:p>
-            <w:pPr>
-              <w:snapToGrid w:val="0"/>
-              <w:spacing w:after="60" w:before="60" w:line="276" w:lineRule="auto"/>
-            </w:pPr>
-            <w:r>
-              <w:rPr>
-                <w:rFonts w:ascii="Times New Roman" w:hAnsi="Times New Roman" w:eastAsia="宋体"/>
-                <w:b w:val="0"/>
-                <w:color w:val="000000"/>
-                <w:sz w:val="19"/>
-              </w:rPr>
-              <w:t>docs: add reproducible runtime demo and verified calculator screenshots</w:t>
-            </w:r>
-          </w:p>
-        </w:tc>
-      </w:tr>
-    </w:tbl>
-    <w:p/>
-    <w:p>
-      <w:pPr>
-        <w:keepNext w:val="0"/>
-        <w:widowControl/>
-        <w:snapToGrid w:val="0"/>
-        <w:spacing w:before="0" w:after="100" w:line="340" w:lineRule="exact"/>
-        <w:ind w:firstLine="0"/>
-      </w:pPr>
-      <w:r>
-        <w:rPr>
-          <w:rFonts w:ascii="Times New Roman" w:hAnsi="Times New Roman" w:eastAsia="宋体"/>
-          <w:b w:val="0"/>
-          <w:color w:val="000000"/>
-          <w:sz w:val="22"/>
-        </w:rPr>
-      </w:r>
-    </w:p>
-    <w:p>
-      <w:pPr>
-        <w:keepNext w:val="0"/>
-        <w:widowControl/>
-        <w:snapToGrid w:val="0"/>
-        <w:spacing w:before="0" w:after="100" w:line="340" w:lineRule="exact"/>
-        <w:ind w:firstLine="0"/>
-      </w:pPr>
-      <w:r>
-        <w:rPr>
-          <w:rFonts w:ascii="Times New Roman" w:hAnsi="Times New Roman" w:eastAsia="宋体"/>
-          <w:b w:val="0"/>
-          <w:color w:val="000000"/>
-          <w:sz w:val="22"/>
-        </w:rPr>
-        <w:t>仓库地址  https://github.com/TabGYC/qt-exp1-calculator-2026</w:t>
-      </w:r>
-    </w:p>
-    <w:p>
-      <w:pPr>
-        <w:keepNext w:val="0"/>
-        <w:widowControl/>
-        <w:snapToGrid w:val="0"/>
-        <w:spacing w:before="0" w:after="100" w:line="340" w:lineRule="exact"/>
-        <w:ind w:firstLine="0"/>
-      </w:pPr>
-      <w:r>
-        <w:rPr>
-          <w:rFonts w:ascii="Times New Roman" w:hAnsi="Times New Roman" w:eastAsia="宋体"/>
-          <w:b w:val="0"/>
-          <w:color w:val="000000"/>
-          <w:sz w:val="22"/>
-        </w:rPr>
-        <w:t>复核命令：git log --oneline --reverse。源码位于 src，自动化测试位于 src/tests，原始日志和截图位于 evidence。</w:t>
-      </w:r>
-    </w:p>
-    <w:p>
-      <w:pPr>
-        <w:keepNext/>
-        <w:widowControl/>
-        <w:snapToGrid w:val="0"/>
-        <w:spacing w:before="140" w:after="100" w:line="380" w:lineRule="exact"/>
-        <w:ind w:firstLine="0"/>
-      </w:pPr>
-      <w:r>
-        <w:rPr>
-          <w:rFonts w:ascii="Times New Roman" w:hAnsi="Times New Roman" w:eastAsia="宋体"/>
-          <w:b/>
-          <w:color w:val="000000"/>
-          <w:sz w:val="24"/>
-        </w:rPr>
-        <w:t>六  AI 辅助开发记录</w:t>
-      </w:r>
-    </w:p>
-    <w:p>
-      <w:pPr>
-        <w:keepNext w:val="0"/>
-        <w:widowControl/>
-        <w:snapToGrid w:val="0"/>
-        <w:spacing w:before="0" w:after="100" w:line="340" w:lineRule="exact"/>
-        <w:ind w:firstLine="0"/>
-      </w:pPr>
-      <w:r>
-        <w:rPr>
-          <w:rFonts w:ascii="Times New Roman" w:hAnsi="Times New Roman" w:eastAsia="宋体"/>
-          <w:b w:val="0"/>
-          <w:color w:val="000000"/>
-          <w:sz w:val="22"/>
-        </w:rPr>
-        <w:t>问题：实验目录仅有任务模板，需要建立可验证的计算器输入状态和事件映射。任务提示摘要：按实验要求补齐程序并验证后完成报告，仓库使用已登录 GitHub 账号且设为私有。</w:t>
+        <w:t>问题：实验目录仅有任务模板，需要建立可验证的计算器输入状态和事件映射。任务提示摘要：按实验要求补齐程序并验证后完成报告，仓库使用已登录 GitHub 账号独立管理，现已公开。</w:t>
       </w:r>
     </w:p>
     <w:p>

</xml_diff>